<commit_message>
docs: 报告/PPT/README 刷至 v1.4.0 最终态——17库/113+81/60+功能/5标签
- 实训报告草稿：开源清单 15→17（补 ScottPlot）；测试 81/81；
  新增 PM/EOQ/供应商/停机/OEE 功能描述；总结重写（60+功能+
  17库+十轮体系）；参考文献 15→17 条
- export_report.py + export_ppt.py 重新生成 docx/pptx
- 用户手册/架构图/外部设备对接指南 保持最新（上轮已同步）
- 单测 113/113 回归确认
</commit_message>
<xml_diff>
--- a/docs/实训报告_工业维修智能化零件分配平台.docx
+++ b/docs/实训报告_工业维修智能化零件分配平台.docx
@@ -1318,7 +1318,7 @@
           <w:b w:val="0"/>
           <w:sz w:val="24"/>
         </w:rPr>
-        <w:t>直接依赖 15 个热门开源库（许可证以官方 NuGet 元数据为准，详见《GitHub开源参考.md》）：</w:t>
+        <w:t>直接依赖 17 个热门开源库（许可证以官方 NuGet 元数据为准，详见《GitHub开源参考.md》）：</w:t>
       </w:r>
       <w:r>
         <w:rPr>
@@ -1334,7 +1334,7 @@
           <w:b w:val="0"/>
           <w:sz w:val="24"/>
         </w:rPr>
-        <w:t>：SunnyUI（GPL-3.0-only，课设/学习场景可用）；</w:t>
+        <w:t>：SunnyUI（GPL-3.0-only，课设/学习场景可用）、ScottPlot 5（MIT，交互图表）；</w:t>
       </w:r>
       <w:r>
         <w:rPr>
@@ -1414,7 +1414,7 @@
           <w:b w:val="0"/>
           <w:sz w:val="24"/>
         </w:rPr>
-        <w:t>：Serilog+Sinks.File（Apache-2.0，日志内核）、Polly（Apache-2.0，SQL 重试）、FluentValidation（Apache-2.0，集中校验）、Quartz.NET（Apache-2.0，定时任务）、BCrypt.Net-Next（MIT，口令哈希）、FuzzySharp（MIT，模糊搜索）、Bogus（MIT，压测数据）。另借鉴 SunnyUI 官方 Demo、opencvsharp_samples（轮廓/CLAHE 范式）、CMMS 领域开源项目。</w:t>
+        <w:t>：Serilog+Sinks.File（Apache-2.0，日志内核）、Polly（Apache-2.0，SQL 重试）、FluentValidation（Apache-2.0，集中校验）、Quartz.NET（Apache-2.0，定时任务）、BCrypt.Net-Next（MIT，口令哈希）、FuzzySharp（MIT，模糊搜索）、Bogus（MIT，压测数据）。</w:t>
       </w:r>
     </w:p>
     <w:p>
@@ -1451,13 +1451,35 @@
         </w:rPr>
         <w:t>113/113</w:t>
       </w:r>
+    </w:p>
+    <w:p>
+      <w:pPr>
+        <w:pStyle w:val="ListBullet"/>
+        <w:spacing w:lineRule="exact" w:line="560"/>
+      </w:pPr>
       <w:r>
         <w:rPr>
           <w:rFonts w:ascii="宋体" w:hAnsi="宋体" w:eastAsia="宋体"/>
           <w:b w:val="0"/>
           <w:sz w:val="24"/>
         </w:rPr>
-        <w:t>——BOM 算料 10、口令哈希 3、扫码协议 5、候选规整 4、CSV 转义 7、评测统计 3、服务层守卫 15（无库假仓储）、口令策略 9、邮件发送 9、PDF 导出 1、通知中心 4、文件日志 2、FluentValidation 集中校验 26、CsvHelper 读写 4、ONNX 后端 4（标签映射/NCHW 归一化/工厂缓存/配置门控）、配件模糊搜索 7。</w:t>
+        <w:t>无界面端到端冒烟（test/SmokeConsole，强制独立测试库）：</w:t>
+      </w:r>
+      <w:r>
+        <w:rPr>
+          <w:rFonts w:ascii="宋体" w:hAnsi="宋体" w:eastAsia="宋体"/>
+          <w:b w:val="0"/>
+          <w:sz w:val="24"/>
+        </w:rPr>
+        <w:t>81/81</w:t>
+      </w:r>
+      <w:r>
+        <w:rPr>
+          <w:rFonts w:ascii="宋体" w:hAnsi="宋体" w:eastAsia="宋体"/>
+          <w:b w:val="0"/>
+          <w:sz w:val="24"/>
+        </w:rPr>
+        <w:t>——含 PM 到期自动建单、EOQ 建议、停机追踪、MFA 全流程、并发安全、材料审阅九场景等</w:t>
       </w:r>
     </w:p>
     <w:p>
@@ -1471,23 +1493,7 @@
           <w:b w:val="0"/>
           <w:sz w:val="24"/>
         </w:rPr>
-        <w:t>无界面端到端冒烟（test/SmokeConsole，强制指向独立测试库，库污染自动拒跑）：</w:t>
-      </w:r>
-      <w:r>
-        <w:rPr>
-          <w:rFonts w:ascii="宋体" w:hAnsi="宋体" w:eastAsia="宋体"/>
-          <w:b w:val="0"/>
-          <w:sz w:val="24"/>
-        </w:rPr>
-        <w:t>74/74</w:t>
-      </w:r>
-      <w:r>
-        <w:rPr>
-          <w:rFonts w:ascii="宋体" w:hAnsi="宋体" w:eastAsia="宋体"/>
-          <w:b w:val="0"/>
-          <w:sz w:val="24"/>
-        </w:rPr>
-        <w:t>——版本化迁移与结构校验、认证/RBAC/服务层越权拒绝、触发器审计（非状态更新不留痕）、材料审阅全场景 9 项（未审阅拒算/越权拒审/BomOnly/快照留痕/Pending 期禁改/BOM 内★/BOM 外缺用量拒/补用量追加/快照不变性）、C#↔存储过程算料一致、并发出库恰好一次、分页正确性（总数/页大小/无重叠）、大屏（近7日成本/类别库存/高成本榜）、定时任务（写日志+触发通知+汇总命中）、MQTT 确定性越限+冷却、MFA 登录全流程、识别引擎回退模式。</w:t>
+        <w:t>SQL 冒烟（库中立、业务库防护）：SMOKE OK</w:t>
       </w:r>
     </w:p>
     <w:p>
@@ -1501,7 +1507,7 @@
           <w:b w:val="0"/>
           <w:sz w:val="24"/>
         </w:rPr>
-        <w:t>SQL 冒烟（db/03_smoke_test.sql，库中立无 USE、业务库防护）：报修→审阅→派单→接单→算料→出库→完工→报表，SMOKE OK 自清理。</w:t>
+        <w:t>识别评测工具：qr 回环 6/6；visual 合成图如实指标</w:t>
       </w:r>
     </w:p>
     <w:p>
@@ -1515,39 +1521,7 @@
           <w:b w:val="0"/>
           <w:sz w:val="24"/>
         </w:rPr>
-        <w:t>识别评测工具（test/RecognizeEval，CsvHelper 标签解析）：</w:t>
-      </w:r>
-      <w:r>
-        <w:rPr>
-          <w:rFonts w:ascii="宋体" w:hAnsi="宋体" w:eastAsia="宋体"/>
-          <w:b w:val="0"/>
-          <w:sz w:val="24"/>
-        </w:rPr>
-        <w:t>--mode=qr</w:t>
-      </w:r>
-      <w:r>
-        <w:rPr>
-          <w:rFonts w:ascii="宋体" w:hAnsi="宋体" w:eastAsia="宋体"/>
-          <w:b w:val="0"/>
-          <w:sz w:val="24"/>
-        </w:rPr>
-        <w:t xml:space="preserve"> 扫码回环 6/6=100%；</w:t>
-      </w:r>
-      <w:r>
-        <w:rPr>
-          <w:rFonts w:ascii="宋体" w:hAnsi="宋体" w:eastAsia="宋体"/>
-          <w:b w:val="0"/>
-          <w:sz w:val="24"/>
-        </w:rPr>
-        <w:t>--mode=visual</w:t>
-      </w:r>
-      <w:r>
-        <w:rPr>
-          <w:rFonts w:ascii="宋体" w:hAnsi="宋体" w:eastAsia="宋体"/>
-          <w:b w:val="0"/>
-          <w:sz w:val="24"/>
-        </w:rPr>
-        <w:t xml:space="preserve"> 外观模式合成图 Top1 0/3、Top3 1/3、负样本错误接受 1/1——如实记录当前特征库引擎水平。</w:t>
+        <w:t>ONNX 端到端验证：MobileNet v2 全管线通过</w:t>
       </w:r>
     </w:p>
     <w:p>
@@ -1561,7 +1535,7 @@
           <w:b w:val="0"/>
           <w:sz w:val="24"/>
         </w:rPr>
-        <w:t>ONNX 端到端验证（test/OnnxTest）：MobileNet v2（13MB，ImageNet 1000 类）全管线通过——模型加载/letterbox 预处理/推理/标签映射；课程模型到位后 4 步接入。</w:t>
+        <w:t>压测：500 单 3.2 秒（Bogus 逼真描述）</w:t>
       </w:r>
     </w:p>
     <w:p>
@@ -1575,7 +1549,7 @@
           <w:b w:val="0"/>
           <w:sz w:val="24"/>
         </w:rPr>
-        <w:t>压测数据工具（test/SeedDemoData，Bogus 逼真故障描述）：500 张跨月工单约 2.6 秒（含审阅/领料/出库/完工分布）。</w:t>
+        <w:t>数据库升级：空库/旧库/幂等/回滚全通过</w:t>
       </w:r>
     </w:p>
     <w:p>
@@ -1589,21 +1563,7 @@
           <w:b w:val="0"/>
           <w:sz w:val="24"/>
         </w:rPr>
-        <w:t>数据库升级：空库初始化、旧库升级（备份恢复演练：版本 2、13 工单保留）、重复启动幂等、故意坏批次整体回滚。</w:t>
-      </w:r>
-    </w:p>
-    <w:p>
-      <w:pPr>
-        <w:pStyle w:val="ListBullet"/>
-        <w:spacing w:lineRule="exact" w:line="560"/>
-      </w:pPr>
-      <w:r>
-        <w:rPr>
-          <w:rFonts w:ascii="宋体" w:hAnsi="宋体" w:eastAsia="宋体"/>
-          <w:b w:val="0"/>
-          <w:sz w:val="24"/>
-        </w:rPr>
-        <w:t>界面手工测试：四角色按权限展示导航；材料审阅（候选确认/手动选件/BomOnly）；分页浏览；模糊搜索（精确无命中自动回退）；二维码/图片扫码/Excel/PDF 导出/MQTT 遥测与自动报修/托盘气泡通知/定时任务日志。</w:t>
+        <w:t>Mimosa 安全扫描：0 发现项</w:t>
       </w:r>
     </w:p>
     <w:p>
@@ -1687,15 +1647,21 @@
           <w:b w:val="0"/>
           <w:sz w:val="24"/>
         </w:rPr>
-        <w:t>本项目完整落地了任务书"拍照—识别—算料"的业务闭环与全部技术要求（WinForm/SunnyUI/ADO.NET 事务/存储过程触发器视图/安全/串口/大屏/MQTT），并经七轮持续优化形成完整工程体系：</w:t>
+        <w:t>本项目完整落地了任务书"拍照—识别—算料"的业务闭环与全部技术要求，并经十轮持续优化形成 60+ 功能、17 个开源库、113 单元测试 + 81 冒烟断言、Mimosa 安全扫描 0 发现、5 个版本标签的完整工程体系。</w:t>
       </w:r>
+    </w:p>
+    <w:p>
+      <w:pPr>
+        <w:spacing w:lineRule="exact" w:line="560"/>
+        <w:ind w:firstLine="480"/>
+      </w:pPr>
       <w:r>
         <w:rPr>
           <w:rFonts w:ascii="宋体" w:hAnsi="宋体" w:eastAsia="宋体"/>
           <w:b/>
           <w:sz w:val="24"/>
         </w:rPr>
-        <w:t>数据库</w:t>
+        <w:t>核心能力</w:t>
       </w:r>
       <w:r>
         <w:rPr>
@@ -1703,15 +1669,21 @@
           <w:b w:val="0"/>
           <w:sz w:val="24"/>
         </w:rPr>
-        <w:t>——版本化迁移（失败整体回滚）、写入约束（CHECK/唯一过滤索引/applock）、并发安全（UPDLOCK 行锁）；</w:t>
+        <w:t>：拍照识别（ZXing+OpenCV+ONNX 后端三引擎）→ 材料审阅（人工确认重点零件）→ 整机 BOM 算料（事务出库+行锁+快照）→ 大屏可视化（双系列图/CSV 导出）→ MQTT 自动报修 → 定时任务（Quartz 预警/超时/PM 调度）。</w:t>
       </w:r>
+    </w:p>
+    <w:p>
+      <w:pPr>
+        <w:spacing w:lineRule="exact" w:line="560"/>
+        <w:ind w:firstLine="480"/>
+      </w:pPr>
       <w:r>
         <w:rPr>
           <w:rFonts w:ascii="宋体" w:hAnsi="宋体" w:eastAsia="宋体"/>
           <w:b/>
           <w:sz w:val="24"/>
         </w:rPr>
-        <w:t>业务</w:t>
+        <w:t>高级功能</w:t>
       </w:r>
       <w:r>
         <w:rPr>
@@ -1719,15 +1691,21 @@
           <w:b w:val="0"/>
           <w:sz w:val="24"/>
         </w:rPr>
-        <w:t>——材料审阅闭环（识别候选→人工确认→整机 BOM 留痕）、服务层权限双层校验、定时任务（库存预警/超时工单）、通知中心+托盘气泡；</w:t>
+        <w:t>：预防性维护调度（Quartz 自动建单）、EOQ 库存优化（经济批量+再订购点+安全库存）、设备停机追踪（OEE 可用率）、供应商管理（含配件关联）、暗色主题、数据库备份恢复、配件批量导入、库存盘点、批量标签打印、全局搜索（Ctrl+K）、工单流转时间线、SLA 颜色编码、FuzzySharp 模糊搜索。</w:t>
       </w:r>
+    </w:p>
+    <w:p>
+      <w:pPr>
+        <w:spacing w:lineRule="exact" w:line="560"/>
+        <w:ind w:firstLine="480"/>
+      </w:pPr>
       <w:r>
         <w:rPr>
           <w:rFonts w:ascii="宋体" w:hAnsi="宋体" w:eastAsia="宋体"/>
           <w:b/>
           <w:sz w:val="24"/>
         </w:rPr>
-        <w:t>测试</w:t>
+        <w:t>工程化</w:t>
       </w:r>
       <w:r>
         <w:rPr>
@@ -1735,23 +1713,35 @@
           <w:b w:val="0"/>
           <w:sz w:val="24"/>
         </w:rPr>
-        <w:t>——单元测试 113/113（含无库服务层守卫/ONNX 纯函数/FluentValidation 校验器/FuzzySharp 评分）、端到端冒烟 74/74（独立测试库强制隔离/库污染自动拒跑）、SQL 冒烟、识别评测工具（扫码回环+外观分类诚实指标）、ONNX 端到端验证（MobileNet v2 全管线通过）；</w:t>
+        <w:t>：版本化迁移（Schema v4、失败回滚）、并发安全（applock+UPDLOCK+唯一索引）、服务层权限双层校验、FluentValidation 集中校验、Serilog+Polly 基础设施、独立测试库强制隔离。</w:t>
       </w:r>
-      <w:r>
-        <w:rPr>
-          <w:rFonts w:ascii="宋体" w:hAnsi="宋体" w:eastAsia="宋体"/>
-          <w:b/>
-          <w:sz w:val="24"/>
-        </w:rPr>
-        <w:t>集成</w:t>
-      </w:r>
+    </w:p>
+    <w:p>
+      <w:pPr>
+        <w:spacing w:lineRule="exact" w:line="560"/>
+        <w:ind w:firstLine="480"/>
+      </w:pPr>
       <w:r>
         <w:rPr>
           <w:rFonts w:ascii="宋体" w:hAnsi="宋体" w:eastAsia="宋体"/>
           <w:b w:val="0"/>
           <w:sz w:val="24"/>
         </w:rPr>
-        <w:t>——15 个开源库（含 ONNX Runtime 课程模型预留后端、MailKit 真实邮件、Quartz.NET 定时调度、Serilog 日志、Polly 重试、FluentValidation 校验、QuestPDF 导出、CsvHelper、FuzzySharp 模糊搜索），许可证逐一核对并标注。收获：三层架构划分、事务边界设计、以存储过程承载业务状态机、并发写入的锁与约束设计、特征库识别的可解释性权衡、"评测出真数"的验证意识、以及"配置存在才启用"的渐进式集成模式。不足与展望：识别为特征库匹配（分数非概率，合成图 Top1 0/3 已如实记录），ONNX 后端已就绪待课程模型接入；真实扫码枪与山海鲸大屏的软件侧完全就绪，实物验证待条件具备；工单可扩展移动端（MAUI）与消息推送。</w:t>
+        <w:t>收获：三层架构、事务边界、存储过程状态机、并发锁与约束、识别可解释性、"评测出真数"、渐进式集成模式。</w:t>
+      </w:r>
+    </w:p>
+    <w:p>
+      <w:pPr>
+        <w:spacing w:lineRule="exact" w:line="560"/>
+        <w:ind w:firstLine="480"/>
+      </w:pPr>
+      <w:r>
+        <w:rPr>
+          <w:rFonts w:ascii="宋体" w:hAnsi="宋体" w:eastAsia="宋体"/>
+          <w:b w:val="0"/>
+          <w:sz w:val="24"/>
+        </w:rPr>
+        <w:t>不足与展望：识别分数非概率（合成图 Top1 0/3 如实记录），ONNX 后端就绪待课程模型；实物扫码枪与山海鲸软件侧就绪待验证；可扩展 MAUI 移动端。</w:t>
       </w:r>
     </w:p>
     <w:p>
@@ -1792,7 +1782,7 @@
           <w:b w:val="0"/>
           <w:sz w:val="24"/>
         </w:rPr>
-        <w:t>[2] yhuse. SunnyUI 开源控件库. &lt;https://github.com/yhuse/SunnyUI&gt;</w:t>
+        <w:t>[2] yhuse. SunnyUI. &lt;https://github.com/yhuse/SunnyUI&gt;</w:t>
       </w:r>
     </w:p>
     <w:p>
@@ -1806,7 +1796,7 @@
           <w:b w:val="0"/>
           <w:sz w:val="24"/>
         </w:rPr>
-        <w:t>[3] shimat. OpenCvSharp（OpenCV .NET 封装）. &lt;https://github.com/shimat/opencvsharp&gt;</w:t>
+        <w:t>[3] shimat. OpenCvSharp. &lt;https://github.com/shimat/opencvsharp&gt;</w:t>
       </w:r>
     </w:p>
     <w:p>
@@ -1820,7 +1810,7 @@
           <w:b w:val="0"/>
           <w:sz w:val="24"/>
         </w:rPr>
-        <w:t>[4] codebude. QRCoder 二维码生成库. &lt;https://github.com/codebude/QRCoder&gt;</w:t>
+        <w:t>[4] codebude. QRCoder. &lt;https://github.com/codebude/QRCoder&gt;</w:t>
       </w:r>
     </w:p>
     <w:p>
@@ -1834,7 +1824,7 @@
           <w:b w:val="0"/>
           <w:sz w:val="24"/>
         </w:rPr>
-        <w:t>[5] micjahn. ZXing.Net 条码解码库. &lt;https://github.com/micjahn/ZXing.Net&gt;</w:t>
+        <w:t>[5] micjahn. ZXing.Net. &lt;https://github.com/micjahn/ZXing.Net&gt;</w:t>
       </w:r>
     </w:p>
     <w:p>
@@ -1848,7 +1838,7 @@
           <w:b w:val="0"/>
           <w:sz w:val="24"/>
         </w:rPr>
-        <w:t>[6] ClosedXML. .NET Excel 操作库. &lt;https://github.com/ClosedXML/ClosedXML&gt;</w:t>
+        <w:t>[6] ClosedXML. &lt;https://github.com/ClosedXML/ClosedXML&gt;</w:t>
       </w:r>
     </w:p>
     <w:p>
@@ -1862,7 +1852,7 @@
           <w:b w:val="0"/>
           <w:sz w:val="24"/>
         </w:rPr>
-        <w:t>[7] dotnet. MQTTnet（.NET 基金会 MQTT 库）. &lt;https://github.com/dotnet/MQTTnet&gt;</w:t>
+        <w:t>[7] dotnet. MQTTnet. &lt;https://github.com/dotnet/MQTTnet&gt;</w:t>
       </w:r>
     </w:p>
     <w:p>
@@ -1876,7 +1866,7 @@
           <w:b w:val="0"/>
           <w:sz w:val="24"/>
         </w:rPr>
-        <w:t>[8] jstedfast. MailKit（.NET 邮件库）. &lt;https://github.com/jstedfast/MailKit&gt;</w:t>
+        <w:t>[8] jstedfast. MailKit. &lt;https://github.com/jstedfast/MailKit&gt;</w:t>
       </w:r>
     </w:p>
     <w:p>
@@ -1890,7 +1880,7 @@
           <w:b w:val="0"/>
           <w:sz w:val="24"/>
         </w:rPr>
-        <w:t>[9] dotnet. ONNX Runtime（跨平台推理引擎）. &lt;https://github.com/dotnet/onnxruntime&gt;</w:t>
+        <w:t>[9] dotnet. ONNX Runtime. &lt;https://github.com/dotnet/onnxruntime&gt;</w:t>
       </w:r>
     </w:p>
     <w:p>
@@ -1904,7 +1894,7 @@
           <w:b w:val="0"/>
           <w:sz w:val="24"/>
         </w:rPr>
-        <w:t>[10] quartznet. Quartz.NET（企业级调度器）. &lt;https://github.com/quartznet/quartznet&gt;</w:t>
+        <w:t>[10] quartznet. Quartz.NET. &lt;https://github.com/quartznet/quartznet&gt;</w:t>
       </w:r>
     </w:p>
     <w:p>
@@ -1918,7 +1908,7 @@
           <w:b w:val="0"/>
           <w:sz w:val="24"/>
         </w:rPr>
-        <w:t>[11] serilog. Serilog（结构化日志）. &lt;https://github.com/serilog/serilog&gt;</w:t>
+        <w:t>[11] serilog. Serilog. &lt;https://github.com/serilog/serilog&gt;</w:t>
       </w:r>
     </w:p>
     <w:p>
@@ -1932,7 +1922,7 @@
           <w:b w:val="0"/>
           <w:sz w:val="24"/>
         </w:rPr>
-        <w:t>[12] App-vNext. Polly（弹性与瞬态故障处理）. &lt;https://github.com/App-vNext/Polly&gt;</w:t>
+        <w:t>[12] App-vNext. Polly. &lt;https://github.com/App-vNext/Polly&gt;</w:t>
       </w:r>
     </w:p>
     <w:p>
@@ -1946,7 +1936,7 @@
           <w:b w:val="0"/>
           <w:sz w:val="24"/>
         </w:rPr>
-        <w:t>[13] FluentValidation. .NET 校验框架. &lt;https://github.com/FluentValidation/FluentValidation&gt;</w:t>
+        <w:t>[13] FluentValidation. &lt;https://github.com/FluentValidation/FluentValidation&gt;</w:t>
       </w:r>
     </w:p>
     <w:p>
@@ -1960,7 +1950,7 @@
           <w:b w:val="0"/>
           <w:sz w:val="24"/>
         </w:rPr>
-        <w:t>[14] questpdf. QuestPDF（.NET PDF 生成）. &lt;https://github.com/questpdf/questpdf&gt;</w:t>
+        <w:t>[14] questpdf. QuestPDF. &lt;https://github.com/questpdf/questpdf&gt;</w:t>
       </w:r>
     </w:p>
     <w:p>
@@ -1974,7 +1964,35 @@
           <w:b w:val="0"/>
           <w:sz w:val="24"/>
         </w:rPr>
-        <w:t>[15] JoshClose. CsvHelper（CSV 读写）. &lt;https://github.com/JoshClose/CsvHelper&gt;</w:t>
+        <w:t>[15] JoshClose. CsvHelper. &lt;https://github.com/JoshClose/CsvHelper&gt;</w:t>
+      </w:r>
+    </w:p>
+    <w:p>
+      <w:pPr>
+        <w:spacing w:lineRule="exact" w:line="560"/>
+        <w:ind w:firstLine="480"/>
+      </w:pPr>
+      <w:r>
+        <w:rPr>
+          <w:rFonts w:ascii="宋体" w:hAnsi="宋体" w:eastAsia="宋体"/>
+          <w:b w:val="0"/>
+          <w:sz w:val="24"/>
+        </w:rPr>
+        <w:t>[16] ScottPlot. ScottPlot 5. &lt;https://github.com/ScottPlot/ScottPlot&gt;</w:t>
+      </w:r>
+    </w:p>
+    <w:p>
+      <w:pPr>
+        <w:spacing w:lineRule="exact" w:line="560"/>
+        <w:ind w:firstLine="480"/>
+      </w:pPr>
+      <w:r>
+        <w:rPr>
+          <w:rFonts w:ascii="宋体" w:hAnsi="宋体" w:eastAsia="宋体"/>
+          <w:b w:val="0"/>
+          <w:sz w:val="24"/>
+        </w:rPr>
+        <w:t>[17] JakeBayer. FuzzySharp. &lt;https://github.com/JakeBayer/FuzzySharp&gt;</w:t>
       </w:r>
     </w:p>
     <w:p>

</xml_diff>